<commit_message>
docs: add Activity and Component diagrams to complete 3-diagram suite (Sequence, Activity, Component) from whiteboard
</commit_message>
<xml_diff>
--- a/docs/Tai_Lieu_Dac_Ta_UseCase_Va_Sequence_Diagram_KTX.docx
+++ b/docs/Tai_Lieu_Dac_Ta_UseCase_Va_Sequence_Diagram_KTX.docx
@@ -23502,6 +23502,279 @@
         </w:tc>
       </w:tr>
     </w:tbl>
+    <w:p>
+      <w:r>
+        <w:br w:type="page"/>
+      </w:r>
+    </w:p>
+    <w:p>
+      <w:pPr>
+        <w:spacing w:before="280" w:after="80" w:line="276" w:lineRule="auto"/>
+        <w:jc w:val="left"/>
+      </w:pPr>
+      <w:r>
+        <w:rPr>
+          <w:rFonts w:ascii="Times New Roman" w:hAnsi="Times New Roman"/>
+          <w:b/>
+          <w:color w:val="1B365D"/>
+          <w:sz w:val="26"/>
+        </w:rPr>
+        <w:t>PHẦN V: BỘ DIAGRAM THEO CHỈ ĐẠO CỦA GIẢNG VIÊN (SEQUENCE, ACTIVITY, COMPONENT)</w:t>
+      </w:r>
+    </w:p>
+    <w:p>
+      <w:pPr>
+        <w:spacing w:before="0" w:after="80" w:line="276" w:lineRule="auto"/>
+        <w:jc w:val="left"/>
+      </w:pPr>
+      <w:r>
+        <w:rPr>
+          <w:rFonts w:ascii="Times New Roman" w:hAnsi="Times New Roman"/>
+          <w:b w:val="0"/>
+          <w:i w:val="0"/>
+          <w:color w:val="1F2937"/>
+          <w:sz w:val="21"/>
+        </w:rPr>
+        <w:t>Căn cứ theo ghi chú trên bảng lớp của Giảng viên: 'Bộ diagram -&gt; Sequence (1), Activity (2), Component (3)', hệ thống KTX Smart Match được phân tích và thiết kế hoàn chỉnh qua ba tầng biểu đồ chuẩn mực:</w:t>
+      </w:r>
+    </w:p>
+    <w:p>
+      <w:pPr>
+        <w:spacing w:before="180" w:after="60" w:line="276" w:lineRule="auto"/>
+        <w:jc w:val="left"/>
+      </w:pPr>
+      <w:r>
+        <w:rPr>
+          <w:rFonts w:ascii="Times New Roman" w:hAnsi="Times New Roman"/>
+          <w:b/>
+          <w:color w:val="2C5282"/>
+          <w:sz w:val="23"/>
+        </w:rPr>
+        <w:t>1. Biểu Đồ Tuần Tự (Sequence Diagram - 1)</w:t>
+      </w:r>
+    </w:p>
+    <w:p>
+      <w:pPr>
+        <w:spacing w:before="0" w:after="80" w:line="276" w:lineRule="auto"/>
+        <w:jc w:val="left"/>
+      </w:pPr>
+      <w:r>
+        <w:rPr>
+          <w:rFonts w:ascii="Times New Roman" w:hAnsi="Times New Roman"/>
+          <w:b w:val="0"/>
+          <w:i w:val="0"/>
+          <w:color w:val="1F2937"/>
+          <w:sz w:val="21"/>
+        </w:rPr>
+        <w:t>Toàn bộ 6 Use Case (UC-01, UC-04, UC-05, UC-13, UC-18, UC-24) đã được mô hình hóa bằng Sequence Diagram chi tiết ở Phần III, đánh số thứ tự thông điệp khớp 1-to-1 với từng Step ID trong Bảng Three Types of Flows (BF-1..n, AF-A..n, EF-A..n), có đầy đủ khối điều kiện rẽ nhánh alt và tùy chọn opt.</w:t>
+      </w:r>
+    </w:p>
+    <w:p>
+      <w:pPr>
+        <w:spacing w:before="180" w:after="60" w:line="276" w:lineRule="auto"/>
+        <w:jc w:val="left"/>
+      </w:pPr>
+      <w:r>
+        <w:rPr>
+          <w:rFonts w:ascii="Times New Roman" w:hAnsi="Times New Roman"/>
+          <w:b/>
+          <w:color w:val="2C5282"/>
+          <w:sz w:val="23"/>
+        </w:rPr>
+        <w:t>2. Biểu Đồ Hoạt Động Tổng Thể (Activity Diagram - 2)</w:t>
+      </w:r>
+    </w:p>
+    <w:p>
+      <w:pPr>
+        <w:spacing w:before="0" w:after="80" w:line="276" w:lineRule="auto"/>
+        <w:jc w:val="left"/>
+      </w:pPr>
+      <w:r>
+        <w:rPr>
+          <w:rFonts w:ascii="Times New Roman" w:hAnsi="Times New Roman"/>
+          <w:b w:val="0"/>
+          <w:i w:val="0"/>
+          <w:color w:val="1F2937"/>
+          <w:sz w:val="21"/>
+        </w:rPr>
+        <w:t>Activity Diagram thể hiện luồng nghiệp vụ end-to-end xuyên suốt toàn bộ vòng đời đăng ký và phân phòng KTX:</w:t>
+      </w:r>
+    </w:p>
+    <w:p>
+      <w:pPr>
+        <w:spacing w:before="0" w:after="80" w:line="276" w:lineRule="auto"/>
+        <w:jc w:val="left"/>
+      </w:pPr>
+      <w:r>
+        <w:rPr>
+          <w:rFonts w:ascii="Times New Roman" w:hAnsi="Times New Roman"/>
+          <w:b w:val="0"/>
+          <w:i w:val="0"/>
+          <w:color w:val="1F2937"/>
+          <w:sz w:val="21"/>
+        </w:rPr>
+        <w:t>• Bước 1 (Khởi tạo): Sinh viên đăng nhập qua cổng trường A (BR-01) -&gt; Mở form chọn loại phòng 2/4/6 người (BR-05) -&gt; Khai báo 8 chỉ số thói quen -&gt; Chọn tiêu chí top x1.5 (BR-06) -&gt; Tích cam kết tối thiểu 1 kỳ (BR-02) -&gt; Nộp đơn (UC-04).</w:t>
+      </w:r>
+    </w:p>
+    <w:p>
+      <w:pPr>
+        <w:spacing w:before="0" w:after="80" w:line="276" w:lineRule="auto"/>
+        <w:jc w:val="left"/>
+      </w:pPr>
+      <w:r>
+        <w:rPr>
+          <w:rFonts w:ascii="Times New Roman" w:hAnsi="Times New Roman"/>
+          <w:b w:val="0"/>
+          <w:i w:val="0"/>
+          <w:color w:val="1F2937"/>
+          <w:sz w:val="21"/>
+        </w:rPr>
+        <w:t>• Bước 2 (Thẩm định Nghiệp vụ): Hồ sơ ở trạng thái Pending_Approval -&gt; Cán bộ KTX thẩm định kỷ luật &amp; quỹ phòng (UC-18) -&gt; Nếu không đạt: Từ chối đơn và gửi email lý do -&gt; Nếu đạt chuẩn: Phê duyệt Business Approve (BR-03), chuyển sang trạng thái Approved_For_Matching.</w:t>
+      </w:r>
+    </w:p>
+    <w:p>
+      <w:pPr>
+        <w:spacing w:before="0" w:after="80" w:line="276" w:lineRule="auto"/>
+        <w:jc w:val="left"/>
+      </w:pPr>
+      <w:r>
+        <w:rPr>
+          <w:rFonts w:ascii="Times New Roman" w:hAnsi="Times New Roman"/>
+          <w:b w:val="0"/>
+          <w:i w:val="0"/>
+          <w:color w:val="1F2937"/>
+          <w:sz w:val="21"/>
+        </w:rPr>
+        <w:t>• Bước 3 (Ghép phòng Tự động): Động cơ Gale-Shapley tính ma trận tương thích 2 chiều -&gt; Chạy thuật toán Gale-Shapley (&lt; 1.0s, NFR-01) -&gt; Gộp cặp lấp đầy 100% giường (BR-05) -&gt; Kiểm chứng triệt tiêu cặp chặn Blocking Pairs = 0 (BR-07, NFR-02) -&gt; Lưu kết quả và công bố.</w:t>
+      </w:r>
+    </w:p>
+    <w:p>
+      <w:pPr>
+        <w:spacing w:before="0" w:after="80" w:line="276" w:lineRule="auto"/>
+        <w:jc w:val="left"/>
+      </w:pPr>
+      <w:r>
+        <w:rPr>
+          <w:rFonts w:ascii="Times New Roman" w:hAnsi="Times New Roman"/>
+          <w:b w:val="0"/>
+          <w:i w:val="0"/>
+          <w:color w:val="1F2937"/>
+          <w:sz w:val="21"/>
+        </w:rPr>
+        <w:t>• Bước 4 (Thanh toán 72h): Hệ thống kích hoạt đồng hồ đếm ngược 72 giờ (BR-04) -&gt; Sinh viên quét mã VNPay-QR nộp 8.000.000 VNĐ (7tr tiền phòng + 1tr cọc) (UC-13) -&gt; Nếu thành công: Cấp hợp đồng số &amp; mã thẻ phòng -&gt; Nếu quá hạn 72h: Tự động hủy kết quả, chuyển sinh viên sang danh sách chờ Waitlist (UC-26).</w:t>
+      </w:r>
+    </w:p>
+    <w:p>
+      <w:pPr>
+        <w:spacing w:before="180" w:after="60" w:line="276" w:lineRule="auto"/>
+        <w:jc w:val="left"/>
+      </w:pPr>
+      <w:r>
+        <w:rPr>
+          <w:rFonts w:ascii="Times New Roman" w:hAnsi="Times New Roman"/>
+          <w:b/>
+          <w:color w:val="2C5282"/>
+          <w:sz w:val="23"/>
+        </w:rPr>
+        <w:t>3. Biểu Đồ Thành Phần Hệ Thống (Component Diagram - 3)</w:t>
+      </w:r>
+    </w:p>
+    <w:p>
+      <w:pPr>
+        <w:spacing w:before="0" w:after="80" w:line="276" w:lineRule="auto"/>
+        <w:jc w:val="left"/>
+      </w:pPr>
+      <w:r>
+        <w:rPr>
+          <w:rFonts w:ascii="Times New Roman" w:hAnsi="Times New Roman"/>
+          <w:b w:val="0"/>
+          <w:i w:val="0"/>
+          <w:color w:val="1F2937"/>
+          <w:sz w:val="21"/>
+        </w:rPr>
+        <w:t>Component Diagram mô tả kiến trúc phân rã 5 tầng module phần mềm và giao thức kết nối:</w:t>
+      </w:r>
+    </w:p>
+    <w:p>
+      <w:pPr>
+        <w:spacing w:before="0" w:after="80" w:line="276" w:lineRule="auto"/>
+        <w:jc w:val="left"/>
+      </w:pPr>
+      <w:r>
+        <w:rPr>
+          <w:rFonts w:ascii="Times New Roman" w:hAnsi="Times New Roman"/>
+          <w:b w:val="0"/>
+          <w:i w:val="0"/>
+          <w:color w:val="1F2937"/>
+          <w:sz w:val="21"/>
+        </w:rPr>
+        <w:t>• Tầng 1 (Presentation Layer): Student Web Portal (giao diện sinh viên Next.js/Tailwind) &amp; Admin Dashboard (giao diện cán bộ thẩm định, điều hành).</w:t>
+      </w:r>
+    </w:p>
+    <w:p>
+      <w:pPr>
+        <w:spacing w:before="0" w:after="80" w:line="276" w:lineRule="auto"/>
+        <w:jc w:val="left"/>
+      </w:pPr>
+      <w:r>
+        <w:rPr>
+          <w:rFonts w:ascii="Times New Roman" w:hAnsi="Times New Roman"/>
+          <w:b w:val="0"/>
+          <w:i w:val="0"/>
+          <w:color w:val="1F2937"/>
+          <w:sz w:val="21"/>
+        </w:rPr>
+        <w:t>• Tầng 2 (Security &amp; Gateway Component): API Gateway, Authentication Service (JWT / HttpOnly Cookie / RBAC), School A Connector (kết nối LDAP/REST đối soát MSSV theo BR-01).</w:t>
+      </w:r>
+    </w:p>
+    <w:p>
+      <w:pPr>
+        <w:spacing w:before="0" w:after="80" w:line="276" w:lineRule="auto"/>
+        <w:jc w:val="left"/>
+      </w:pPr>
+      <w:r>
+        <w:rPr>
+          <w:rFonts w:ascii="Times New Roman" w:hAnsi="Times New Roman"/>
+          <w:b w:val="0"/>
+          <w:i w:val="0"/>
+          <w:color w:val="1F2937"/>
+          <w:sz w:val="21"/>
+        </w:rPr>
+        <w:t>• Tầng 3 (Core Business Services): Application &amp; Approval Service (thẩm định đơn BR-02, BR-03), Scoring &amp; Ranking Service (ma trận 2 chiều BR-06), Gale-Shapley Matching Engine (BP=0, BR-07, NFR-01), Room Occupancy Optimizer (lấp đầy 100% giường BR-05), Timer &amp; Cleanup Scheduler (đếm ngược 72h BR-04, UC-26).</w:t>
+      </w:r>
+    </w:p>
+    <w:p>
+      <w:pPr>
+        <w:spacing w:before="0" w:after="80" w:line="276" w:lineRule="auto"/>
+        <w:jc w:val="left"/>
+      </w:pPr>
+      <w:r>
+        <w:rPr>
+          <w:rFonts w:ascii="Times New Roman" w:hAnsi="Times New Roman"/>
+          <w:b w:val="0"/>
+          <w:i w:val="0"/>
+          <w:color w:val="1F2937"/>
+          <w:sz w:val="21"/>
+        </w:rPr>
+        <w:t>• Tầng 4 (External Integration Component): VNPay Payment Adapter (tạo QR động, xử lý Webhook IPN, đối soát chữ ký băm SHA-256 theo NFR-03), E-Contract &amp; Receipt Generator (sinh hợp đồng điện tử &amp; biên lai có mã QR).</w:t>
+      </w:r>
+    </w:p>
+    <w:p>
+      <w:pPr>
+        <w:spacing w:before="0" w:after="80" w:line="276" w:lineRule="auto"/>
+        <w:jc w:val="left"/>
+      </w:pPr>
+      <w:r>
+        <w:rPr>
+          <w:rFonts w:ascii="Times New Roman" w:hAnsi="Times New Roman"/>
+          <w:b w:val="0"/>
+          <w:i w:val="0"/>
+          <w:color w:val="1F2937"/>
+          <w:sz w:val="21"/>
+        </w:rPr>
+        <w:t>• Tầng 5 (Persistence Layer): Relational Database KTX (PostgreSQL/SQLite lưu sinh viên, phòng, hồ sơ, giao dịch) &amp; Audit Log (lưu vết bảo mật và chứng chỉ cặp chặn).</w:t>
+      </w:r>
+    </w:p>
     <w:sectPr>
       <w:pgSz w:w="11909" w:h="16834"/>
       <w:pgMar w:top="1152" w:right="1224" w:bottom="1152" w:left="1224" w:header="720" w:footer="720" w:gutter="0"/>

</xml_diff>